<commit_message>
docs: update UserStory for ch01
</commit_message>
<xml_diff>
--- a/UserStory.docx
+++ b/UserStory.docx
@@ -12,6 +12,14 @@
           <w:lang w:val="en-US"/>
         </w:rPr>
       </w:pPr>
+      <w:r>
+        <w:rPr>
+          <w:b/>
+          <w:bCs/>
+          <w:lang w:val="en-US"/>
+        </w:rPr>
+        <w:t xml:space="preserve"> </w:t>
+      </w:r>
       <w:r>
         <w:rPr>
           <w:b/>
@@ -104,6 +112,176 @@
     </w:p>
     <w:p>
       <w:pPr>
+        <w:pStyle w:val="ListParagraph"/>
+        <w:spacing w:line="360" w:lineRule="auto"/>
+        <w:ind w:left="360"/>
+        <w:jc w:val="both"/>
+        <w:rPr>
+          <w:lang w:val="en-US"/>
+        </w:rPr>
+      </w:pPr>
+      <w:r>
+        <w:rPr>
+          <w:lang w:val="en-US"/>
+        </w:rPr>
+        <w:t>- Tiêu chí nghiệm thu:</w:t>
+      </w:r>
+    </w:p>
+    <w:p>
+      <w:pPr>
+        <w:pStyle w:val="ListParagraph"/>
+        <w:numPr>
+          <w:ilvl w:val="0"/>
+          <w:numId w:val="6"/>
+        </w:numPr>
+        <w:spacing w:line="360" w:lineRule="auto"/>
+        <w:jc w:val="both"/>
+        <w:rPr>
+          <w:lang w:val="en-US"/>
+        </w:rPr>
+      </w:pPr>
+      <w:r>
+        <w:t>Sinh viên đang ở trang "Quản lý thông tin cá nhân"</w:t>
+      </w:r>
+      <w:r>
+        <w:rPr>
+          <w:lang w:val="en-US"/>
+        </w:rPr>
+        <w:t xml:space="preserve"> </w:t>
+      </w:r>
+      <w:r>
+        <w:rPr>
+          <w:rFonts w:ascii="Segoe UI Symbol" w:hAnsi="Segoe UI Symbol" w:cs="Segoe UI Symbol"/>
+        </w:rPr>
+        <w:t>➜</w:t>
+      </w:r>
+      <w:r>
+        <w:rPr>
+          <w:lang w:val="en-US"/>
+        </w:rPr>
+        <w:t xml:space="preserve"> </w:t>
+      </w:r>
+      <w:r>
+        <w:t>Sinh viên thay đổi thông tin hợp lệ và nhấn nút "Lưu".</w:t>
+      </w:r>
+      <w:r>
+        <w:rPr>
+          <w:lang w:val="en-US"/>
+        </w:rPr>
+        <w:t xml:space="preserve"> </w:t>
+      </w:r>
+      <w:r>
+        <w:rPr>
+          <w:rFonts w:ascii="Segoe UI Symbol" w:hAnsi="Segoe UI Symbol" w:cs="Segoe UI Symbol"/>
+        </w:rPr>
+        <w:t>➜</w:t>
+      </w:r>
+      <w:r>
+        <w:rPr>
+          <w:rFonts w:ascii="Segoe UI Symbol" w:hAnsi="Segoe UI Symbol" w:cs="Segoe UI Symbol"/>
+          <w:lang w:val="en-US"/>
+        </w:rPr>
+        <w:t xml:space="preserve"> </w:t>
+      </w:r>
+      <w:r>
+        <w:rPr>
+          <w:rFonts w:asciiTheme="majorHAnsi" w:hAnsiTheme="majorHAnsi" w:cstheme="majorHAnsi"/>
+          <w:lang w:val="en-US"/>
+        </w:rPr>
+        <w:t xml:space="preserve">Hệ thống cập nhật vào </w:t>
+      </w:r>
+      <w:r>
+        <w:rPr>
+          <w:rFonts w:asciiTheme="majorHAnsi" w:hAnsiTheme="majorHAnsi" w:cstheme="majorHAnsi"/>
+          <w:lang w:val="en-US"/>
+        </w:rPr>
+        <w:t>database</w:t>
+      </w:r>
+      <w:r>
+        <w:rPr>
+          <w:rFonts w:asciiTheme="majorHAnsi" w:hAnsiTheme="majorHAnsi" w:cstheme="majorHAnsi"/>
+          <w:lang w:val="en-US"/>
+        </w:rPr>
+        <w:t xml:space="preserve"> </w:t>
+      </w:r>
+      <w:r>
+        <w:rPr>
+          <w:rFonts w:asciiTheme="majorHAnsi" w:hAnsiTheme="majorHAnsi" w:cstheme="majorHAnsi"/>
+        </w:rPr>
+        <w:t>và hiển thị thông báo "Cập nhật thành công"</w:t>
+      </w:r>
+    </w:p>
+    <w:p>
+      <w:pPr>
+        <w:pStyle w:val="ListParagraph"/>
+        <w:numPr>
+          <w:ilvl w:val="0"/>
+          <w:numId w:val="6"/>
+        </w:numPr>
+        <w:spacing w:line="360" w:lineRule="auto"/>
+        <w:jc w:val="both"/>
+        <w:rPr>
+          <w:lang w:val="en-US"/>
+        </w:rPr>
+      </w:pPr>
+      <w:r>
+        <w:t>Sinh viên đang ở trang "Quản lý thông tin cá nhân"</w:t>
+      </w:r>
+      <w:r>
+        <w:rPr>
+          <w:lang w:val="en-US"/>
+        </w:rPr>
+        <w:t xml:space="preserve"> </w:t>
+      </w:r>
+      <w:r>
+        <w:rPr>
+          <w:rFonts w:ascii="Segoe UI Symbol" w:hAnsi="Segoe UI Symbol" w:cs="Segoe UI Symbol"/>
+        </w:rPr>
+        <w:t>➜</w:t>
+      </w:r>
+      <w:r>
+        <w:rPr>
+          <w:rFonts w:ascii="Segoe UI Symbol" w:hAnsi="Segoe UI Symbol" w:cs="Segoe UI Symbol"/>
+          <w:lang w:val="en-US"/>
+        </w:rPr>
+        <w:t xml:space="preserve"> </w:t>
+      </w:r>
+      <w:r>
+        <w:rPr>
+          <w:rFonts w:asciiTheme="majorHAnsi" w:hAnsiTheme="majorHAnsi" w:cstheme="majorHAnsi"/>
+          <w:lang w:val="en-US"/>
+        </w:rPr>
+        <w:t>Sinh viên bỏ trống các trường dữ liệu bắt buộc</w:t>
+      </w:r>
+      <w:r>
+        <w:rPr>
+          <w:rFonts w:asciiTheme="majorHAnsi" w:hAnsiTheme="majorHAnsi" w:cstheme="majorHAnsi"/>
+          <w:lang w:val="en-US"/>
+        </w:rPr>
+        <w:t xml:space="preserve"> </w:t>
+      </w:r>
+      <w:r>
+        <w:rPr>
+          <w:rFonts w:ascii="Segoe UI Symbol" w:hAnsi="Segoe UI Symbol" w:cs="Segoe UI Symbol"/>
+        </w:rPr>
+        <w:t>➜</w:t>
+      </w:r>
+      <w:r>
+        <w:rPr>
+          <w:rFonts w:asciiTheme="majorHAnsi" w:hAnsiTheme="majorHAnsi" w:cstheme="majorHAnsi"/>
+          <w:lang w:val="en-US"/>
+        </w:rPr>
+        <w:t xml:space="preserve"> </w:t>
+      </w:r>
+      <w:r>
+        <w:rPr>
+          <w:rFonts w:asciiTheme="majorHAnsi" w:hAnsiTheme="majorHAnsi" w:cstheme="majorHAnsi"/>
+        </w:rPr>
+        <w:t>Hệ thống không lưu dữ liệu và hiển thị cảnh báo lỗi màu đỏ</w:t>
+      </w:r>
+    </w:p>
+    <w:p>
+      <w:pPr>
         <w:spacing w:line="360" w:lineRule="auto"/>
         <w:jc w:val="both"/>
         <w:rPr>
@@ -158,12 +336,152 @@
     <w:p>
       <w:pPr>
         <w:pStyle w:val="ListParagraph"/>
+        <w:numPr>
+          <w:ilvl w:val="0"/>
+          <w:numId w:val="4"/>
+        </w:numPr>
         <w:spacing w:line="360" w:lineRule="auto"/>
         <w:jc w:val="both"/>
         <w:rPr>
           <w:lang w:val="en-US"/>
         </w:rPr>
       </w:pPr>
+      <w:r>
+        <w:rPr>
+          <w:lang w:val="en-US"/>
+        </w:rPr>
+        <w:t>Tiêu chí nghiệm thu:</w:t>
+      </w:r>
+    </w:p>
+    <w:p>
+      <w:pPr>
+        <w:pStyle w:val="ListParagraph"/>
+        <w:numPr>
+          <w:ilvl w:val="1"/>
+          <w:numId w:val="4"/>
+        </w:numPr>
+        <w:spacing w:line="360" w:lineRule="auto"/>
+        <w:jc w:val="both"/>
+        <w:rPr>
+          <w:lang w:val="en-US"/>
+        </w:rPr>
+      </w:pPr>
+      <w:r>
+        <w:t>Sinh viên đang là thành viên của câu lạc bộ và ở trang thông tin CLB</w:t>
+      </w:r>
+      <w:r>
+        <w:rPr>
+          <w:lang w:val="en-US"/>
+        </w:rPr>
+        <w:t xml:space="preserve"> </w:t>
+      </w:r>
+      <w:r>
+        <w:rPr>
+          <w:rFonts w:ascii="Segoe UI Symbol" w:hAnsi="Segoe UI Symbol" w:cs="Segoe UI Symbol"/>
+        </w:rPr>
+        <w:t>➜</w:t>
+      </w:r>
+      <w:r>
+        <w:rPr>
+          <w:rFonts w:ascii="Segoe UI Symbol" w:hAnsi="Segoe UI Symbol" w:cs="Segoe UI Symbol"/>
+          <w:lang w:val="en-US"/>
+        </w:rPr>
+        <w:t xml:space="preserve"> </w:t>
+      </w:r>
+      <w:r>
+        <w:t>Sinh viên nhấn nút "Rời CLB" và chọn "Xác nhận"</w:t>
+      </w:r>
+      <w:r>
+        <w:rPr>
+          <w:lang w:val="en-US"/>
+        </w:rPr>
+        <w:t xml:space="preserve"> </w:t>
+      </w:r>
+      <w:r>
+        <w:rPr>
+          <w:rFonts w:ascii="Segoe UI Symbol" w:hAnsi="Segoe UI Symbol" w:cs="Segoe UI Symbol"/>
+        </w:rPr>
+        <w:t>➜</w:t>
+      </w:r>
+      <w:r>
+        <w:rPr>
+          <w:rFonts w:ascii="Segoe UI Symbol" w:hAnsi="Segoe UI Symbol" w:cs="Segoe UI Symbol"/>
+          <w:lang w:val="en-US"/>
+        </w:rPr>
+        <w:t xml:space="preserve"> </w:t>
+      </w:r>
+      <w:r>
+        <w:t>Hệ thống gỡ sinh viên khỏi danh sách thành viên của CLB và chuyển hướng về trang chủ</w:t>
+      </w:r>
+    </w:p>
+    <w:p>
+      <w:pPr>
+        <w:pStyle w:val="ListParagraph"/>
+        <w:numPr>
+          <w:ilvl w:val="1"/>
+          <w:numId w:val="4"/>
+        </w:numPr>
+        <w:spacing w:line="360" w:lineRule="auto"/>
+        <w:jc w:val="both"/>
+        <w:rPr>
+          <w:lang w:val="en-US"/>
+        </w:rPr>
+      </w:pPr>
+      <w:r>
+        <w:t xml:space="preserve">Sinh viên đã nhấn nút "Rời CLB" và </w:t>
+      </w:r>
+      <w:r>
+        <w:t>hiển thị</w:t>
+      </w:r>
+      <w:r>
+        <w:rPr>
+          <w:lang w:val="en-US"/>
+        </w:rPr>
+        <w:t xml:space="preserve"> </w:t>
+      </w:r>
+      <w:r>
+        <w:t xml:space="preserve">popup cảnh báo </w:t>
+      </w:r>
+      <w:r>
+        <w:rPr>
+          <w:rFonts w:ascii="Segoe UI Symbol" w:hAnsi="Segoe UI Symbol" w:cs="Segoe UI Symbol"/>
+          <w:lang w:val="en-US"/>
+        </w:rPr>
+        <w:t>➜</w:t>
+      </w:r>
+      <w:r>
+        <w:rPr>
+          <w:rFonts w:ascii="Segoe UI Symbol" w:hAnsi="Segoe UI Symbol" w:cs="Segoe UI Symbol"/>
+          <w:lang w:val="en-US"/>
+        </w:rPr>
+        <w:t xml:space="preserve"> </w:t>
+      </w:r>
+      <w:r>
+        <w:t>Sinh viên chọn "Hủy bỏ"</w:t>
+      </w:r>
+      <w:r>
+        <w:rPr>
+          <w:lang w:val="en-US"/>
+        </w:rPr>
+        <w:t xml:space="preserve"> </w:t>
+      </w:r>
+      <w:r>
+        <w:rPr>
+          <w:rFonts w:ascii="Segoe UI Symbol" w:hAnsi="Segoe UI Symbol" w:cs="Segoe UI Symbol"/>
+          <w:lang w:val="en-US"/>
+        </w:rPr>
+        <w:t>➜</w:t>
+      </w:r>
+      <w:r>
+        <w:rPr>
+          <w:rFonts w:ascii="Segoe UI Symbol" w:hAnsi="Segoe UI Symbol" w:cs="Segoe UI Symbol"/>
+          <w:lang w:val="en-US"/>
+        </w:rPr>
+        <w:t xml:space="preserve"> </w:t>
+      </w:r>
+      <w:r>
+        <w:t>Popup đóng lại, thao tác bị hủy và sinh viên vẫn tiếp tục là thành viên của CLB</w:t>
+      </w:r>
     </w:p>
     <w:p>
       <w:pPr>
@@ -239,33 +557,6 @@
     </w:p>
     <w:p>
       <w:pPr>
-        <w:spacing w:line="360" w:lineRule="auto"/>
-        <w:jc w:val="both"/>
-        <w:rPr>
-          <w:lang w:val="en-US"/>
-        </w:rPr>
-      </w:pPr>
-      <w:r>
-        <w:rPr>
-          <w:lang w:val="en-US"/>
-        </w:rPr>
-        <w:t>US-04:</w:t>
-      </w:r>
-      <w:r>
-        <w:rPr>
-          <w:lang w:val="en-US"/>
-        </w:rPr>
-        <w:t xml:space="preserve"> </w:t>
-      </w:r>
-      <w:r>
-        <w:rPr>
-          <w:lang w:val="en-US"/>
-        </w:rPr>
-        <w:t>Thông báo sinh viên rời câu lạc bộ</w:t>
-      </w:r>
-    </w:p>
-    <w:p>
-      <w:pPr>
         <w:pStyle w:val="ListParagraph"/>
         <w:numPr>
           <w:ilvl w:val="0"/>
@@ -281,42 +572,88 @@
         <w:rPr>
           <w:lang w:val="en-US"/>
         </w:rPr>
-        <w:t>Là ban quản lý CLB, tôi muốn</w:t>
-      </w:r>
-      <w:r>
-        <w:rPr>
-          <w:lang w:val="en-US"/>
-        </w:rPr>
-        <w:t xml:space="preserve"> </w:t>
-      </w:r>
-      <w:r>
-        <w:rPr>
-          <w:lang w:val="en-US"/>
-        </w:rPr>
-        <w:t>có thông báo khi sinh viên rời câu lạc bộ để nắm rõ số lượng thành viên theo thời gian thực</w:t>
+        <w:t>Tiêu chí nghiệm thu</w:t>
       </w:r>
     </w:p>
     <w:p>
       <w:pPr>
+        <w:pStyle w:val="ListParagraph"/>
+        <w:numPr>
+          <w:ilvl w:val="1"/>
+          <w:numId w:val="4"/>
+        </w:numPr>
         <w:spacing w:line="360" w:lineRule="auto"/>
         <w:jc w:val="both"/>
         <w:rPr>
-          <w:b/>
-          <w:bCs/>
-          <w:lang w:val="en-US"/>
-        </w:rPr>
-      </w:pPr>
-      <w:r>
-        <w:rPr>
-          <w:b/>
-          <w:bCs/>
-          <w:lang w:val="en-US"/>
-        </w:rPr>
-        <w:t>Admin:</w:t>
+          <w:lang w:val="en-US"/>
+        </w:rPr>
+      </w:pPr>
+      <w:r>
+        <w:t>Ban quản lý đang ở trang quản lý sự kiện</w:t>
+      </w:r>
+      <w:r>
+        <w:rPr>
+          <w:lang w:val="en-US"/>
+        </w:rPr>
+        <w:t xml:space="preserve"> </w:t>
+      </w:r>
+      <w:r>
+        <w:rPr>
+          <w:rFonts w:ascii="Segoe UI Symbol" w:hAnsi="Segoe UI Symbol" w:cs="Segoe UI Symbol"/>
+          <w:lang w:val="en-US"/>
+        </w:rPr>
+        <w:t>➜</w:t>
+      </w:r>
+      <w:r>
+        <w:rPr>
+          <w:rFonts w:ascii="Segoe UI Symbol" w:hAnsi="Segoe UI Symbol" w:cs="Segoe UI Symbol"/>
+          <w:lang w:val="en-US"/>
+        </w:rPr>
+        <w:t xml:space="preserve"> </w:t>
+      </w:r>
+      <w:r>
+        <w:t>Ban quản lý chọn "Xóa" một sự kiện có trạng thái "Sắp diễn ra" và xác nhận</w:t>
+      </w:r>
+      <w:r>
+        <w:rPr>
+          <w:lang w:val="en-US"/>
+        </w:rPr>
+        <w:t xml:space="preserve"> </w:t>
+      </w:r>
+      <w:r>
+        <w:rPr>
+          <w:rFonts w:ascii="Segoe UI Symbol" w:hAnsi="Segoe UI Symbol" w:cs="Segoe UI Symbol"/>
+          <w:lang w:val="en-US"/>
+        </w:rPr>
+        <w:t>➜</w:t>
+      </w:r>
+      <w:r>
+        <w:rPr>
+          <w:rFonts w:ascii="Segoe UI Symbol" w:hAnsi="Segoe UI Symbol" w:cs="Segoe UI Symbol"/>
+          <w:lang w:val="en-US"/>
+        </w:rPr>
+        <w:t xml:space="preserve"> </w:t>
+      </w:r>
+      <w:r>
+        <w:t xml:space="preserve">Sự kiện bị gỡ khỏi lịch chung và hệ thống tự động gửi thông báo hủy đến tất cả </w:t>
+      </w:r>
+      <w:r>
+        <w:rPr>
+          <w:lang w:val="en-US"/>
+        </w:rPr>
+        <w:t xml:space="preserve">các </w:t>
+      </w:r>
+      <w:r>
+        <w:t>sinh viên đã đăng ký</w:t>
       </w:r>
     </w:p>
     <w:p>
       <w:pPr>
+        <w:pStyle w:val="ListParagraph"/>
+        <w:numPr>
+          <w:ilvl w:val="1"/>
+          <w:numId w:val="4"/>
+        </w:numPr>
         <w:spacing w:line="360" w:lineRule="auto"/>
         <w:jc w:val="both"/>
         <w:rPr>
@@ -324,16 +661,97 @@
         </w:rPr>
       </w:pPr>
       <w:r>
-        <w:rPr>
-          <w:lang w:val="en-US"/>
-        </w:rPr>
-        <w:t>US-05:</w:t>
-      </w:r>
-      <w:r>
-        <w:rPr>
-          <w:lang w:val="en-US"/>
-        </w:rPr>
-        <w:t xml:space="preserve"> Thêm thành viên mới</w:t>
+        <w:lastRenderedPageBreak/>
+        <w:t>Ban quản lý đang ở trang quản lý sự kiện</w:t>
+      </w:r>
+      <w:r>
+        <w:rPr>
+          <w:lang w:val="en-US"/>
+        </w:rPr>
+        <w:t xml:space="preserve"> </w:t>
+      </w:r>
+      <w:r>
+        <w:rPr>
+          <w:rFonts w:ascii="Segoe UI Symbol" w:hAnsi="Segoe UI Symbol" w:cs="Segoe UI Symbol"/>
+          <w:lang w:val="en-US"/>
+        </w:rPr>
+        <w:t>➜</w:t>
+      </w:r>
+      <w:r>
+        <w:rPr>
+          <w:lang w:val="en-US"/>
+        </w:rPr>
+        <w:t xml:space="preserve"> T</w:t>
+      </w:r>
+      <w:r>
+        <w:t>rạng thái của sự kiện là "Đang diễn ra" hoặc "Đã kết thúc"</w:t>
+      </w:r>
+      <w:r>
+        <w:rPr>
+          <w:lang w:val="en-US"/>
+        </w:rPr>
+        <w:t xml:space="preserve"> </w:t>
+      </w:r>
+      <w:r>
+        <w:rPr>
+          <w:rFonts w:ascii="Segoe UI Symbol" w:hAnsi="Segoe UI Symbol" w:cs="Segoe UI Symbol"/>
+          <w:lang w:val="en-US"/>
+        </w:rPr>
+        <w:t>➜</w:t>
+      </w:r>
+      <w:r>
+        <w:rPr>
+          <w:lang w:val="en-US"/>
+        </w:rPr>
+        <w:t xml:space="preserve"> </w:t>
+      </w:r>
+      <w:r>
+        <w:t>Hệ thống</w:t>
+      </w:r>
+      <w:r>
+        <w:rPr>
+          <w:lang w:val="en-US"/>
+        </w:rPr>
+        <w:t xml:space="preserve"> </w:t>
+      </w:r>
+      <w:r>
+        <w:t>vô hiệu hóa</w:t>
+      </w:r>
+      <w:r>
+        <w:rPr>
+          <w:lang w:val="en-US"/>
+        </w:rPr>
+        <w:t xml:space="preserve"> </w:t>
+      </w:r>
+      <w:r>
+        <w:t>nút "Xóa"</w:t>
+      </w:r>
+    </w:p>
+    <w:p>
+      <w:pPr>
+        <w:spacing w:line="360" w:lineRule="auto"/>
+        <w:jc w:val="both"/>
+        <w:rPr>
+          <w:lang w:val="en-US"/>
+        </w:rPr>
+      </w:pPr>
+      <w:r>
+        <w:rPr>
+          <w:lang w:val="en-US"/>
+        </w:rPr>
+        <w:t>US-04:</w:t>
+      </w:r>
+      <w:r>
+        <w:rPr>
+          <w:lang w:val="en-US"/>
+        </w:rPr>
+        <w:t xml:space="preserve"> </w:t>
+      </w:r>
+      <w:r>
+        <w:rPr>
+          <w:lang w:val="en-US"/>
+        </w:rPr>
+        <w:t>Thông báo sinh viên rời câu lạc bộ</w:t>
       </w:r>
     </w:p>
     <w:p>
@@ -353,6 +771,257 @@
         <w:rPr>
           <w:lang w:val="en-US"/>
         </w:rPr>
+        <w:t>Là ban quản lý CLB, tôi muốn</w:t>
+      </w:r>
+      <w:r>
+        <w:rPr>
+          <w:lang w:val="en-US"/>
+        </w:rPr>
+        <w:t xml:space="preserve"> </w:t>
+      </w:r>
+      <w:r>
+        <w:rPr>
+          <w:lang w:val="en-US"/>
+        </w:rPr>
+        <w:t>có thông báo khi sinh viên rời câu lạc bộ để nắm rõ số lượng thành viên theo thời gian thực</w:t>
+      </w:r>
+    </w:p>
+    <w:p>
+      <w:pPr>
+        <w:pStyle w:val="ListParagraph"/>
+        <w:numPr>
+          <w:ilvl w:val="0"/>
+          <w:numId w:val="4"/>
+        </w:numPr>
+        <w:spacing w:line="360" w:lineRule="auto"/>
+        <w:jc w:val="both"/>
+        <w:rPr>
+          <w:lang w:val="en-US"/>
+        </w:rPr>
+      </w:pPr>
+      <w:r>
+        <w:rPr>
+          <w:lang w:val="en-US"/>
+        </w:rPr>
+        <w:t>Tiêu chí nghiệm thu:</w:t>
+      </w:r>
+    </w:p>
+    <w:p>
+      <w:pPr>
+        <w:pStyle w:val="ListParagraph"/>
+        <w:numPr>
+          <w:ilvl w:val="1"/>
+          <w:numId w:val="4"/>
+        </w:numPr>
+        <w:spacing w:line="360" w:lineRule="auto"/>
+        <w:jc w:val="both"/>
+        <w:rPr>
+          <w:lang w:val="en-US"/>
+        </w:rPr>
+      </w:pPr>
+      <w:r>
+        <w:t>Ban quản lý đang đăng nhập vào hệ thống</w:t>
+      </w:r>
+      <w:r>
+        <w:rPr>
+          <w:lang w:val="en-US"/>
+        </w:rPr>
+        <w:t xml:space="preserve"> </w:t>
+      </w:r>
+      <w:r>
+        <w:rPr>
+          <w:rFonts w:ascii="Segoe UI Symbol" w:hAnsi="Segoe UI Symbol" w:cs="Segoe UI Symbol"/>
+          <w:lang w:val="en-US"/>
+        </w:rPr>
+        <w:t>➜</w:t>
+      </w:r>
+      <w:r>
+        <w:rPr>
+          <w:rFonts w:ascii="Segoe UI Symbol" w:hAnsi="Segoe UI Symbol" w:cs="Segoe UI Symbol"/>
+          <w:lang w:val="en-US"/>
+        </w:rPr>
+        <w:t xml:space="preserve"> </w:t>
+      </w:r>
+      <w:r>
+        <w:t>Có một sinh viên vừa</w:t>
+      </w:r>
+      <w:r>
+        <w:rPr>
+          <w:lang w:val="en-US"/>
+        </w:rPr>
+        <w:t xml:space="preserve"> </w:t>
+      </w:r>
+      <w:r>
+        <w:t>rời khỏi câu lạc bộ</w:t>
+      </w:r>
+      <w:r>
+        <w:rPr>
+          <w:lang w:val="en-US"/>
+        </w:rPr>
+        <w:t xml:space="preserve"> </w:t>
+      </w:r>
+      <w:r>
+        <w:rPr>
+          <w:rFonts w:ascii="Segoe UI Symbol" w:hAnsi="Segoe UI Symbol" w:cs="Segoe UI Symbol"/>
+          <w:lang w:val="en-US"/>
+        </w:rPr>
+        <w:t>➜</w:t>
+      </w:r>
+      <w:r>
+        <w:rPr>
+          <w:lang w:val="en-US"/>
+        </w:rPr>
+        <w:t xml:space="preserve"> </w:t>
+      </w:r>
+      <w:r>
+        <w:t>Hệ thống hiển thị thông báo</w:t>
+      </w:r>
+      <w:r>
+        <w:rPr>
+          <w:lang w:val="en-US"/>
+        </w:rPr>
+        <w:t xml:space="preserve"> </w:t>
+      </w:r>
+      <w:r>
+        <w:t>ngay lập tức</w:t>
+      </w:r>
+    </w:p>
+    <w:p>
+      <w:pPr>
+        <w:pStyle w:val="ListParagraph"/>
+        <w:numPr>
+          <w:ilvl w:val="1"/>
+          <w:numId w:val="4"/>
+        </w:numPr>
+        <w:spacing w:line="360" w:lineRule="auto"/>
+        <w:jc w:val="both"/>
+        <w:rPr>
+          <w:lang w:val="en-US"/>
+        </w:rPr>
+      </w:pPr>
+      <w:r>
+        <w:t>Ban quản lý đang mở xem</w:t>
+      </w:r>
+      <w:r>
+        <w:rPr>
+          <w:lang w:val="en-US"/>
+        </w:rPr>
+        <w:t xml:space="preserve"> </w:t>
+      </w:r>
+      <w:r>
+        <w:t>dashboard</w:t>
+      </w:r>
+      <w:r>
+        <w:rPr>
+          <w:lang w:val="en-US"/>
+        </w:rPr>
+        <w:t xml:space="preserve"> </w:t>
+      </w:r>
+      <w:r>
+        <w:rPr>
+          <w:rFonts w:ascii="Segoe UI Symbol" w:hAnsi="Segoe UI Symbol" w:cs="Segoe UI Symbol"/>
+          <w:lang w:val="en-US"/>
+        </w:rPr>
+        <w:t>➜</w:t>
+      </w:r>
+      <w:r>
+        <w:rPr>
+          <w:lang w:val="en-US"/>
+        </w:rPr>
+        <w:t xml:space="preserve"> </w:t>
+      </w:r>
+      <w:r>
+        <w:t>Một sinh viên rời câu lạc bộ</w:t>
+      </w:r>
+      <w:r>
+        <w:rPr>
+          <w:lang w:val="en-US"/>
+        </w:rPr>
+        <w:t xml:space="preserve"> </w:t>
+      </w:r>
+      <w:r>
+        <w:rPr>
+          <w:rFonts w:ascii="Segoe UI Symbol" w:hAnsi="Segoe UI Symbol" w:cs="Segoe UI Symbol"/>
+          <w:lang w:val="en-US"/>
+        </w:rPr>
+        <w:t>➜</w:t>
+      </w:r>
+      <w:r>
+        <w:rPr>
+          <w:lang w:val="en-US"/>
+        </w:rPr>
+        <w:t xml:space="preserve"> </w:t>
+      </w:r>
+      <w:r>
+        <w:t xml:space="preserve">Tổng số lượng thành viên hiển thị trên dashboard </w:t>
+      </w:r>
+      <w:r>
+        <w:rPr>
+          <w:lang w:val="en-US"/>
+        </w:rPr>
+        <w:t xml:space="preserve">liền </w:t>
+      </w:r>
+      <w:r>
+        <w:t>tự động giảm đi 1</w:t>
+      </w:r>
+    </w:p>
+    <w:p>
+      <w:pPr>
+        <w:spacing w:line="360" w:lineRule="auto"/>
+        <w:jc w:val="both"/>
+        <w:rPr>
+          <w:b/>
+          <w:bCs/>
+          <w:lang w:val="en-US"/>
+        </w:rPr>
+      </w:pPr>
+      <w:r>
+        <w:rPr>
+          <w:b/>
+          <w:bCs/>
+          <w:lang w:val="en-US"/>
+        </w:rPr>
+        <w:t>Admin:</w:t>
+      </w:r>
+    </w:p>
+    <w:p>
+      <w:pPr>
+        <w:spacing w:line="360" w:lineRule="auto"/>
+        <w:jc w:val="both"/>
+        <w:rPr>
+          <w:lang w:val="en-US"/>
+        </w:rPr>
+      </w:pPr>
+      <w:r>
+        <w:rPr>
+          <w:lang w:val="en-US"/>
+        </w:rPr>
+        <w:t>US-05:</w:t>
+      </w:r>
+      <w:r>
+        <w:rPr>
+          <w:lang w:val="en-US"/>
+        </w:rPr>
+        <w:t xml:space="preserve"> Thêm thành viên mới</w:t>
+      </w:r>
+    </w:p>
+    <w:p>
+      <w:pPr>
+        <w:pStyle w:val="ListParagraph"/>
+        <w:numPr>
+          <w:ilvl w:val="0"/>
+          <w:numId w:val="4"/>
+        </w:numPr>
+        <w:spacing w:line="360" w:lineRule="auto"/>
+        <w:jc w:val="both"/>
+        <w:rPr>
+          <w:lang w:val="en-US"/>
+        </w:rPr>
+      </w:pPr>
+      <w:r>
+        <w:rPr>
+          <w:lang w:val="en-US"/>
+        </w:rPr>
         <w:t>Là Admin</w:t>
       </w:r>
       <w:r>
@@ -378,6 +1047,174 @@
           <w:lang w:val="en-US"/>
         </w:rPr>
         <w:t xml:space="preserve"> và sinh viên</w:t>
+      </w:r>
+    </w:p>
+    <w:p>
+      <w:pPr>
+        <w:pStyle w:val="ListParagraph"/>
+        <w:numPr>
+          <w:ilvl w:val="1"/>
+          <w:numId w:val="4"/>
+        </w:numPr>
+        <w:spacing w:line="360" w:lineRule="auto"/>
+        <w:jc w:val="both"/>
+        <w:rPr>
+          <w:lang w:val="en-US"/>
+        </w:rPr>
+      </w:pPr>
+      <w:r>
+        <w:t>Admin đang ở trang "Quản lý thành viên"</w:t>
+      </w:r>
+      <w:r>
+        <w:rPr>
+          <w:lang w:val="en-US"/>
+        </w:rPr>
+        <w:t xml:space="preserve"> </w:t>
+      </w:r>
+      <w:r>
+        <w:rPr>
+          <w:rFonts w:ascii="Segoe UI Symbol" w:hAnsi="Segoe UI Symbol" w:cs="Segoe UI Symbol"/>
+          <w:lang w:val="en-US"/>
+        </w:rPr>
+        <w:t>➜</w:t>
+      </w:r>
+      <w:r>
+        <w:rPr>
+          <w:lang w:val="en-US"/>
+        </w:rPr>
+        <w:t xml:space="preserve"> </w:t>
+      </w:r>
+      <w:r>
+        <w:t xml:space="preserve">Admin điền đầy đủ Mã sinh viên, </w:t>
+      </w:r>
+      <w:r>
+        <w:rPr>
+          <w:lang w:val="en-US"/>
+        </w:rPr>
+        <w:t>h</w:t>
+      </w:r>
+      <w:r>
+        <w:t xml:space="preserve">ọ tên, </w:t>
+      </w:r>
+      <w:r>
+        <w:rPr>
+          <w:lang w:val="en-US"/>
+        </w:rPr>
+        <w:t>r</w:t>
+      </w:r>
+      <w:r>
+        <w:t>ole và nhấn nút "Thêm"</w:t>
+      </w:r>
+      <w:r>
+        <w:rPr>
+          <w:lang w:val="en-US"/>
+        </w:rPr>
+        <w:t xml:space="preserve"> </w:t>
+      </w:r>
+      <w:r>
+        <w:rPr>
+          <w:rFonts w:ascii="Segoe UI Symbol" w:hAnsi="Segoe UI Symbol" w:cs="Segoe UI Symbol"/>
+          <w:lang w:val="en-US"/>
+        </w:rPr>
+        <w:t>➜</w:t>
+      </w:r>
+      <w:r>
+        <w:rPr>
+          <w:rFonts w:ascii="Segoe UI Symbol" w:hAnsi="Segoe UI Symbol" w:cs="Segoe UI Symbol"/>
+          <w:lang w:val="en-US"/>
+        </w:rPr>
+        <w:t xml:space="preserve"> </w:t>
+      </w:r>
+      <w:r>
+        <w:t>Tài khoản được tạo thành công</w:t>
+      </w:r>
+    </w:p>
+    <w:p>
+      <w:pPr>
+        <w:pStyle w:val="ListParagraph"/>
+        <w:numPr>
+          <w:ilvl w:val="1"/>
+          <w:numId w:val="4"/>
+        </w:numPr>
+        <w:spacing w:line="360" w:lineRule="auto"/>
+        <w:jc w:val="both"/>
+        <w:rPr>
+          <w:lang w:val="en-US"/>
+        </w:rPr>
+      </w:pPr>
+      <w:r>
+        <w:t>Admin đang ở trang "Quản lý thành viên"</w:t>
+      </w:r>
+      <w:r>
+        <w:rPr>
+          <w:lang w:val="en-US"/>
+        </w:rPr>
+        <w:t xml:space="preserve"> </w:t>
+      </w:r>
+      <w:r>
+        <w:rPr>
+          <w:rFonts w:ascii="Segoe UI Symbol" w:hAnsi="Segoe UI Symbol" w:cs="Segoe UI Symbol"/>
+          <w:lang w:val="en-US"/>
+        </w:rPr>
+        <w:t>➜</w:t>
+      </w:r>
+      <w:r>
+        <w:rPr>
+          <w:lang w:val="en-US"/>
+        </w:rPr>
+        <w:t xml:space="preserve"> </w:t>
+      </w:r>
+      <w:r>
+        <w:t xml:space="preserve">Admin nhập một </w:t>
+      </w:r>
+      <w:r>
+        <w:rPr>
+          <w:lang w:val="en-US"/>
+        </w:rPr>
+        <w:t xml:space="preserve">MSSV </w:t>
+      </w:r>
+      <w:r>
+        <w:t>đã tồn tại và nhấn nút "Thêm"</w:t>
+      </w:r>
+      <w:r>
+        <w:rPr>
+          <w:lang w:val="en-US"/>
+        </w:rPr>
+        <w:t xml:space="preserve"> </w:t>
+      </w:r>
+      <w:r>
+        <w:rPr>
+          <w:rFonts w:ascii="Segoe UI Symbol" w:hAnsi="Segoe UI Symbol" w:cs="Segoe UI Symbol"/>
+          <w:lang w:val="en-US"/>
+        </w:rPr>
+        <w:t>➜</w:t>
+      </w:r>
+      <w:r>
+        <w:rPr>
+          <w:lang w:val="en-US"/>
+        </w:rPr>
+        <w:t xml:space="preserve"> </w:t>
+      </w:r>
+      <w:r>
+        <w:t xml:space="preserve">Hệ thống chặn </w:t>
+      </w:r>
+      <w:r>
+        <w:rPr>
+          <w:lang w:val="en-US"/>
+        </w:rPr>
+        <w:t xml:space="preserve">và </w:t>
+      </w:r>
+      <w:r>
+        <w:t>báo lỗi "Thành viên</w:t>
+      </w:r>
+      <w:r>
+        <w:rPr>
+          <w:lang w:val="en-US"/>
+        </w:rPr>
+        <w:t xml:space="preserve"> </w:t>
+      </w:r>
+      <w:r>
+        <w:t>này đã tồn tại trong hệ thống"</w:t>
       </w:r>
     </w:p>
     <w:sectPr>
@@ -393,6 +1230,95 @@
 <file path=word/numbering.xml><?xml version="1.0" encoding="utf-8"?>
 <w:numbering xmlns:wpc="http://schemas.microsoft.com/office/word/2010/wordprocessingCanvas" xmlns:cx="http://schemas.microsoft.com/office/drawing/2014/chartex" xmlns:cx1="http://schemas.microsoft.com/office/drawing/2015/9/8/chartex" xmlns:cx2="http://schemas.microsoft.com/office/drawing/2015/10/21/chartex" xmlns:cx3="http://schemas.microsoft.com/office/drawing/2016/5/9/chartex" xmlns:cx4="http://schemas.microsoft.com/office/drawing/2016/5/10/chartex" xmlns:cx5="http://schemas.microsoft.com/office/drawing/2016/5/11/chartex" xmlns:cx6="http://schemas.microsoft.com/office/drawing/2016/5/12/chartex" xmlns:cx7="http://schemas.microsoft.com/office/drawing/2016/5/13/chartex" xmlns:cx8="http://schemas.microsoft.com/office/drawing/2016/5/14/chartex" xmlns:mc="http://schemas.openxmlformats.org/markup-compatibility/2006" xmlns:aink="http://schemas.microsoft.com/office/drawing/2016/ink" xmlns:am3d="http://schemas.microsoft.com/office/drawing/2017/model3d" xmlns:o="urn:schemas-microsoft-com:office:office" xmlns:oel="http://schemas.microsoft.com/office/2019/extlst" xmlns:r="http://schemas.openxmlformats.org/officeDocument/2006/relationships" xmlns:m="http://schemas.openxmlformats.org/officeDocument/2006/math" xmlns:v="urn:schemas-microsoft-com:vml" xmlns:wp14="http://schemas.microsoft.com/office/word/2010/wordprocessingDrawing" xmlns:wp="http://schemas.openxmlformats.org/drawingml/2006/wordprocessingDrawing" xmlns:w10="urn:schemas-microsoft-com:office:word" xmlns:w="http://schemas.openxmlformats.org/wordprocessingml/2006/main" xmlns:w14="http://schemas.microsoft.com/office/word/2010/wordml" xmlns:w15="http://schemas.microsoft.com/office/word/2012/wordml" xmlns:w16cex="http://schemas.microsoft.com/office/word/2018/wordml/cex" xmlns:w16cid="http://schemas.microsoft.com/office/word/2016/wordml/cid" xmlns:w16="http://schemas.microsoft.com/office/word/2018/wordml" xmlns:w16du="http://schemas.microsoft.com/office/word/2023/wordml/word16du" xmlns:w16sdtdh="http://schemas.microsoft.com/office/word/2020/wordml/sdtdatahash" xmlns:w16sdtfl="http://schemas.microsoft.com/office/word/2024/wordml/sdtformatlock" xmlns:w16se="http://schemas.microsoft.com/office/word/2015/wordml/symex" xmlns:wpg="http://schemas.microsoft.com/office/word/2010/wordprocessingGroup" xmlns:wpi="http://schemas.microsoft.com/office/word/2010/wordprocessingInk" xmlns:wne="http://schemas.microsoft.com/office/word/2006/wordml" xmlns:wps="http://schemas.microsoft.com/office/word/2010/wordprocessingShape" mc:Ignorable="w14 w15 w16se w16cid w16 w16cex w16sdtdh w16sdtfl w16du wp14">
   <w:abstractNum w:abstractNumId="0" w15:restartNumberingAfterBreak="0">
+    <w:nsid w:val="1FFE797C"/>
+    <w:multiLevelType w:val="hybridMultilevel"/>
+    <w:tmpl w:val="DE1ED704"/>
+    <w:lvl w:ilvl="0" w:tplc="2AD8EB22">
+      <w:start w:val="1"/>
+      <w:numFmt w:val="decimal"/>
+      <w:lvlText w:val="%1."/>
+      <w:lvlJc w:val="left"/>
+      <w:pPr>
+        <w:ind w:left="1080" w:hanging="360"/>
+      </w:pPr>
+      <w:rPr>
+        <w:rFonts w:hint="default"/>
+      </w:rPr>
+    </w:lvl>
+    <w:lvl w:ilvl="1" w:tplc="042A0019" w:tentative="1">
+      <w:start w:val="1"/>
+      <w:numFmt w:val="lowerLetter"/>
+      <w:lvlText w:val="%2."/>
+      <w:lvlJc w:val="left"/>
+      <w:pPr>
+        <w:ind w:left="1440" w:hanging="360"/>
+      </w:pPr>
+    </w:lvl>
+    <w:lvl w:ilvl="2" w:tplc="042A001B" w:tentative="1">
+      <w:start w:val="1"/>
+      <w:numFmt w:val="lowerRoman"/>
+      <w:lvlText w:val="%3."/>
+      <w:lvlJc w:val="right"/>
+      <w:pPr>
+        <w:ind w:left="2160" w:hanging="180"/>
+      </w:pPr>
+    </w:lvl>
+    <w:lvl w:ilvl="3" w:tplc="042A000F" w:tentative="1">
+      <w:start w:val="1"/>
+      <w:numFmt w:val="decimal"/>
+      <w:lvlText w:val="%4."/>
+      <w:lvlJc w:val="left"/>
+      <w:pPr>
+        <w:ind w:left="2880" w:hanging="360"/>
+      </w:pPr>
+    </w:lvl>
+    <w:lvl w:ilvl="4" w:tplc="042A0019" w:tentative="1">
+      <w:start w:val="1"/>
+      <w:numFmt w:val="lowerLetter"/>
+      <w:lvlText w:val="%5."/>
+      <w:lvlJc w:val="left"/>
+      <w:pPr>
+        <w:ind w:left="3600" w:hanging="360"/>
+      </w:pPr>
+    </w:lvl>
+    <w:lvl w:ilvl="5" w:tplc="042A001B" w:tentative="1">
+      <w:start w:val="1"/>
+      <w:numFmt w:val="lowerRoman"/>
+      <w:lvlText w:val="%6."/>
+      <w:lvlJc w:val="right"/>
+      <w:pPr>
+        <w:ind w:left="4320" w:hanging="180"/>
+      </w:pPr>
+    </w:lvl>
+    <w:lvl w:ilvl="6" w:tplc="042A000F" w:tentative="1">
+      <w:start w:val="1"/>
+      <w:numFmt w:val="decimal"/>
+      <w:lvlText w:val="%7."/>
+      <w:lvlJc w:val="left"/>
+      <w:pPr>
+        <w:ind w:left="5040" w:hanging="360"/>
+      </w:pPr>
+    </w:lvl>
+    <w:lvl w:ilvl="7" w:tplc="042A0019" w:tentative="1">
+      <w:start w:val="1"/>
+      <w:numFmt w:val="lowerLetter"/>
+      <w:lvlText w:val="%8."/>
+      <w:lvlJc w:val="left"/>
+      <w:pPr>
+        <w:ind w:left="5760" w:hanging="360"/>
+      </w:pPr>
+    </w:lvl>
+    <w:lvl w:ilvl="8" w:tplc="042A001B" w:tentative="1">
+      <w:start w:val="1"/>
+      <w:numFmt w:val="lowerRoman"/>
+      <w:lvlText w:val="%9."/>
+      <w:lvlJc w:val="right"/>
+      <w:pPr>
+        <w:ind w:left="6480" w:hanging="180"/>
+      </w:pPr>
+    </w:lvl>
+  </w:abstractNum>
+  <w:abstractNum w:abstractNumId="1" w15:restartNumberingAfterBreak="0">
     <w:nsid w:val="35BB7D31"/>
     <w:multiLevelType w:val="hybridMultilevel"/>
     <w:tmpl w:val="572A5200"/>
@@ -481,10 +1407,10 @@
       </w:pPr>
     </w:lvl>
   </w:abstractNum>
-  <w:abstractNum w:abstractNumId="1" w15:restartNumberingAfterBreak="0">
+  <w:abstractNum w:abstractNumId="2" w15:restartNumberingAfterBreak="0">
     <w:nsid w:val="3C276692"/>
     <w:multiLevelType w:val="hybridMultilevel"/>
-    <w:tmpl w:val="F3E2BF40"/>
+    <w:tmpl w:val="10644C28"/>
     <w:lvl w:ilvl="0" w:tplc="5EBA9036">
       <w:start w:val="1"/>
       <w:numFmt w:val="bullet"/>
@@ -497,104 +1423,104 @@
         <w:rFonts w:ascii="Times New Roman" w:eastAsiaTheme="minorHAnsi" w:hAnsi="Times New Roman" w:cs="Times New Roman" w:hint="default"/>
       </w:rPr>
     </w:lvl>
-    <w:lvl w:ilvl="1" w:tplc="042A0003" w:tentative="1">
+    <w:lvl w:ilvl="1" w:tplc="2AD8EB22">
+      <w:start w:val="1"/>
+      <w:numFmt w:val="decimal"/>
+      <w:lvlText w:val="%2."/>
+      <w:lvlJc w:val="left"/>
+      <w:pPr>
+        <w:ind w:left="1080" w:hanging="360"/>
+      </w:pPr>
+      <w:rPr>
+        <w:rFonts w:hint="default"/>
+      </w:rPr>
+    </w:lvl>
+    <w:lvl w:ilvl="2" w:tplc="042A0005" w:tentative="1">
+      <w:start w:val="1"/>
+      <w:numFmt w:val="bullet"/>
+      <w:lvlText w:val=""/>
+      <w:lvlJc w:val="left"/>
+      <w:pPr>
+        <w:ind w:left="2160" w:hanging="360"/>
+      </w:pPr>
+      <w:rPr>
+        <w:rFonts w:ascii="Wingdings" w:hAnsi="Wingdings" w:hint="default"/>
+      </w:rPr>
+    </w:lvl>
+    <w:lvl w:ilvl="3" w:tplc="042A0001" w:tentative="1">
+      <w:start w:val="1"/>
+      <w:numFmt w:val="bullet"/>
+      <w:lvlText w:val=""/>
+      <w:lvlJc w:val="left"/>
+      <w:pPr>
+        <w:ind w:left="2880" w:hanging="360"/>
+      </w:pPr>
+      <w:rPr>
+        <w:rFonts w:ascii="Symbol" w:hAnsi="Symbol" w:hint="default"/>
+      </w:rPr>
+    </w:lvl>
+    <w:lvl w:ilvl="4" w:tplc="042A0003" w:tentative="1">
       <w:start w:val="1"/>
       <w:numFmt w:val="bullet"/>
       <w:lvlText w:val="o"/>
       <w:lvlJc w:val="left"/>
       <w:pPr>
-        <w:ind w:left="1440" w:hanging="360"/>
+        <w:ind w:left="3600" w:hanging="360"/>
       </w:pPr>
       <w:rPr>
         <w:rFonts w:ascii="Courier New" w:hAnsi="Courier New" w:cs="Courier New" w:hint="default"/>
       </w:rPr>
     </w:lvl>
-    <w:lvl w:ilvl="2" w:tplc="042A0005" w:tentative="1">
+    <w:lvl w:ilvl="5" w:tplc="042A0005" w:tentative="1">
       <w:start w:val="1"/>
       <w:numFmt w:val="bullet"/>
       <w:lvlText w:val=""/>
       <w:lvlJc w:val="left"/>
       <w:pPr>
-        <w:ind w:left="2160" w:hanging="360"/>
+        <w:ind w:left="4320" w:hanging="360"/>
       </w:pPr>
       <w:rPr>
         <w:rFonts w:ascii="Wingdings" w:hAnsi="Wingdings" w:hint="default"/>
       </w:rPr>
     </w:lvl>
-    <w:lvl w:ilvl="3" w:tplc="042A0001" w:tentative="1">
+    <w:lvl w:ilvl="6" w:tplc="042A0001" w:tentative="1">
       <w:start w:val="1"/>
       <w:numFmt w:val="bullet"/>
       <w:lvlText w:val=""/>
       <w:lvlJc w:val="left"/>
       <w:pPr>
-        <w:ind w:left="2880" w:hanging="360"/>
+        <w:ind w:left="5040" w:hanging="360"/>
       </w:pPr>
       <w:rPr>
         <w:rFonts w:ascii="Symbol" w:hAnsi="Symbol" w:hint="default"/>
       </w:rPr>
     </w:lvl>
-    <w:lvl w:ilvl="4" w:tplc="042A0003" w:tentative="1">
+    <w:lvl w:ilvl="7" w:tplc="042A0003" w:tentative="1">
       <w:start w:val="1"/>
       <w:numFmt w:val="bullet"/>
       <w:lvlText w:val="o"/>
       <w:lvlJc w:val="left"/>
       <w:pPr>
-        <w:ind w:left="3600" w:hanging="360"/>
+        <w:ind w:left="5760" w:hanging="360"/>
       </w:pPr>
       <w:rPr>
         <w:rFonts w:ascii="Courier New" w:hAnsi="Courier New" w:cs="Courier New" w:hint="default"/>
       </w:rPr>
     </w:lvl>
-    <w:lvl w:ilvl="5" w:tplc="042A0005" w:tentative="1">
+    <w:lvl w:ilvl="8" w:tplc="042A0005" w:tentative="1">
       <w:start w:val="1"/>
       <w:numFmt w:val="bullet"/>
       <w:lvlText w:val=""/>
       <w:lvlJc w:val="left"/>
       <w:pPr>
-        <w:ind w:left="4320" w:hanging="360"/>
+        <w:ind w:left="6480" w:hanging="360"/>
       </w:pPr>
       <w:rPr>
         <w:rFonts w:ascii="Wingdings" w:hAnsi="Wingdings" w:hint="default"/>
       </w:rPr>
     </w:lvl>
-    <w:lvl w:ilvl="6" w:tplc="042A0001" w:tentative="1">
-      <w:start w:val="1"/>
-      <w:numFmt w:val="bullet"/>
-      <w:lvlText w:val=""/>
-      <w:lvlJc w:val="left"/>
-      <w:pPr>
-        <w:ind w:left="5040" w:hanging="360"/>
-      </w:pPr>
-      <w:rPr>
-        <w:rFonts w:ascii="Symbol" w:hAnsi="Symbol" w:hint="default"/>
-      </w:rPr>
-    </w:lvl>
-    <w:lvl w:ilvl="7" w:tplc="042A0003" w:tentative="1">
-      <w:start w:val="1"/>
-      <w:numFmt w:val="bullet"/>
-      <w:lvlText w:val="o"/>
-      <w:lvlJc w:val="left"/>
-      <w:pPr>
-        <w:ind w:left="5760" w:hanging="360"/>
-      </w:pPr>
-      <w:rPr>
-        <w:rFonts w:ascii="Courier New" w:hAnsi="Courier New" w:cs="Courier New" w:hint="default"/>
-      </w:rPr>
-    </w:lvl>
-    <w:lvl w:ilvl="8" w:tplc="042A0005" w:tentative="1">
-      <w:start w:val="1"/>
-      <w:numFmt w:val="bullet"/>
-      <w:lvlText w:val=""/>
-      <w:lvlJc w:val="left"/>
-      <w:pPr>
-        <w:ind w:left="6480" w:hanging="360"/>
-      </w:pPr>
-      <w:rPr>
-        <w:rFonts w:ascii="Wingdings" w:hAnsi="Wingdings" w:hint="default"/>
-      </w:rPr>
-    </w:lvl>
   </w:abstractNum>
-  <w:abstractNum w:abstractNumId="2" w15:restartNumberingAfterBreak="0">
+  <w:abstractNum w:abstractNumId="3" w15:restartNumberingAfterBreak="0">
     <w:nsid w:val="3D4A7245"/>
     <w:multiLevelType w:val="hybridMultilevel"/>
     <w:tmpl w:val="229051F6"/>
@@ -706,7 +1632,7 @@
       </w:rPr>
     </w:lvl>
   </w:abstractNum>
-  <w:abstractNum w:abstractNumId="3" w15:restartNumberingAfterBreak="0">
+  <w:abstractNum w:abstractNumId="4" w15:restartNumberingAfterBreak="0">
     <w:nsid w:val="5DD918D3"/>
     <w:multiLevelType w:val="hybridMultilevel"/>
     <w:tmpl w:val="3D8EFB52"/>
@@ -795,17 +1721,112 @@
       </w:pPr>
     </w:lvl>
   </w:abstractNum>
+  <w:abstractNum w:abstractNumId="5" w15:restartNumberingAfterBreak="0">
+    <w:nsid w:val="6B0D1CE4"/>
+    <w:multiLevelType w:val="hybridMultilevel"/>
+    <w:tmpl w:val="0C58D7D2"/>
+    <w:lvl w:ilvl="0" w:tplc="2AD8EB22">
+      <w:start w:val="1"/>
+      <w:numFmt w:val="decimal"/>
+      <w:lvlText w:val="%1."/>
+      <w:lvlJc w:val="left"/>
+      <w:pPr>
+        <w:ind w:left="1080" w:hanging="360"/>
+      </w:pPr>
+      <w:rPr>
+        <w:rFonts w:hint="default"/>
+      </w:rPr>
+    </w:lvl>
+    <w:lvl w:ilvl="1" w:tplc="042A0019" w:tentative="1">
+      <w:start w:val="1"/>
+      <w:numFmt w:val="lowerLetter"/>
+      <w:lvlText w:val="%2."/>
+      <w:lvlJc w:val="left"/>
+      <w:pPr>
+        <w:ind w:left="1800" w:hanging="360"/>
+      </w:pPr>
+    </w:lvl>
+    <w:lvl w:ilvl="2" w:tplc="042A001B" w:tentative="1">
+      <w:start w:val="1"/>
+      <w:numFmt w:val="lowerRoman"/>
+      <w:lvlText w:val="%3."/>
+      <w:lvlJc w:val="right"/>
+      <w:pPr>
+        <w:ind w:left="2520" w:hanging="180"/>
+      </w:pPr>
+    </w:lvl>
+    <w:lvl w:ilvl="3" w:tplc="042A000F" w:tentative="1">
+      <w:start w:val="1"/>
+      <w:numFmt w:val="decimal"/>
+      <w:lvlText w:val="%4."/>
+      <w:lvlJc w:val="left"/>
+      <w:pPr>
+        <w:ind w:left="3240" w:hanging="360"/>
+      </w:pPr>
+    </w:lvl>
+    <w:lvl w:ilvl="4" w:tplc="042A0019" w:tentative="1">
+      <w:start w:val="1"/>
+      <w:numFmt w:val="lowerLetter"/>
+      <w:lvlText w:val="%5."/>
+      <w:lvlJc w:val="left"/>
+      <w:pPr>
+        <w:ind w:left="3960" w:hanging="360"/>
+      </w:pPr>
+    </w:lvl>
+    <w:lvl w:ilvl="5" w:tplc="042A001B" w:tentative="1">
+      <w:start w:val="1"/>
+      <w:numFmt w:val="lowerRoman"/>
+      <w:lvlText w:val="%6."/>
+      <w:lvlJc w:val="right"/>
+      <w:pPr>
+        <w:ind w:left="4680" w:hanging="180"/>
+      </w:pPr>
+    </w:lvl>
+    <w:lvl w:ilvl="6" w:tplc="042A000F" w:tentative="1">
+      <w:start w:val="1"/>
+      <w:numFmt w:val="decimal"/>
+      <w:lvlText w:val="%7."/>
+      <w:lvlJc w:val="left"/>
+      <w:pPr>
+        <w:ind w:left="5400" w:hanging="360"/>
+      </w:pPr>
+    </w:lvl>
+    <w:lvl w:ilvl="7" w:tplc="042A0019" w:tentative="1">
+      <w:start w:val="1"/>
+      <w:numFmt w:val="lowerLetter"/>
+      <w:lvlText w:val="%8."/>
+      <w:lvlJc w:val="left"/>
+      <w:pPr>
+        <w:ind w:left="6120" w:hanging="360"/>
+      </w:pPr>
+    </w:lvl>
+    <w:lvl w:ilvl="8" w:tplc="042A001B" w:tentative="1">
+      <w:start w:val="1"/>
+      <w:numFmt w:val="lowerRoman"/>
+      <w:lvlText w:val="%9."/>
+      <w:lvlJc w:val="right"/>
+      <w:pPr>
+        <w:ind w:left="6840" w:hanging="180"/>
+      </w:pPr>
+    </w:lvl>
+  </w:abstractNum>
   <w:num w:numId="1" w16cid:durableId="133179201">
+    <w:abstractNumId w:val="3"/>
+  </w:num>
+  <w:num w:numId="2" w16cid:durableId="1845897708">
+    <w:abstractNumId w:val="4"/>
+  </w:num>
+  <w:num w:numId="3" w16cid:durableId="1755275958">
+    <w:abstractNumId w:val="1"/>
+  </w:num>
+  <w:num w:numId="4" w16cid:durableId="1043674406">
     <w:abstractNumId w:val="2"/>
   </w:num>
-  <w:num w:numId="2" w16cid:durableId="1845897708">
-    <w:abstractNumId w:val="3"/>
+  <w:num w:numId="5" w16cid:durableId="1266034437">
+    <w:abstractNumId w:val="5"/>
   </w:num>
-  <w:num w:numId="3" w16cid:durableId="1755275958">
+  <w:num w:numId="6" w16cid:durableId="1607233086">
     <w:abstractNumId w:val="0"/>
-  </w:num>
-  <w:num w:numId="4" w16cid:durableId="1043674406">
-    <w:abstractNumId w:val="1"/>
   </w:num>
 </w:numbering>
 </file>
@@ -1413,6 +2434,7 @@
   <w:style w:type="character" w:default="1" w:styleId="DefaultParagraphFont">
     <w:name w:val="Default Paragraph Font"/>
     <w:uiPriority w:val="1"/>
+    <w:semiHidden/>
     <w:unhideWhenUsed/>
   </w:style>
   <w:style w:type="table" w:default="1" w:styleId="TableNormal">

</xml_diff>